<commit_message>
Add Stage 8–9 PRA loop, fix peer-gap quality gates, and refresh A2 artifacts.
Hardens matched peer comparison (no silent zero / all-neutral A2), exports
figures via _show_plt, and adds dual episodes, PRA notes, and re-run checklist.
</commit_message>
<xml_diff>
--- a/docs/assignment1/BoE_Earnings_Insights_Report.docx
+++ b/docs/assignment1/BoE_Earnings_Insights_Report.docx
@@ -2,7 +2,7 @@
 <file path=word/document.xml><?xml version="1.0" encoding="utf-8"?>
 <w:document xmlns:w="http://schemas.openxmlformats.org/wordprocessingml/2006/main" xmlns:m="http://schemas.openxmlformats.org/officeDocument/2006/math" xmlns:r="http://schemas.openxmlformats.org/officeDocument/2006/relationships" xmlns:o="urn:schemas-microsoft-com:office:office" xmlns:v="urn:schemas-microsoft-com:vml" xmlns:w10="urn:schemas-microsoft-com:office:word" xmlns:a="http://schemas.openxmlformats.org/drawingml/2006/main" xmlns:pic="http://schemas.openxmlformats.org/drawingml/2006/picture" xmlns:wp="http://schemas.openxmlformats.org/drawingml/2006/wordprocessingDrawing">
   <w:body>
-    <w:bookmarkStart w:id="29" w:name="X545cb09bed18178e128aac78730f3e2f3ef556c"/>
+    <w:bookmarkStart w:id="30" w:name="X545cb09bed18178e128aac78730f3e2f3ef556c"/>
     <w:p>
       <w:pPr>
         <w:pStyle w:val="Heading1"/>
@@ -2868,7 +2868,326 @@
     </w:p>
     <w:bookmarkEnd w:id="24"/>
     <w:bookmarkEnd w:id="25"/>
-    <w:bookmarkStart w:id="26" w:name="recommendations"/>
+    <w:bookmarkStart w:id="26" w:name="supervisory-episode-hsbc-2025-h1"/>
+    <w:p>
+      <w:pPr>
+        <w:pStyle w:val="Heading2"/>
+      </w:pPr>
+      <w:r>
+        <w:t xml:space="preserve">6.5 Supervisory episode (HSBC 2025-H1)</w:t>
+      </w:r>
+    </w:p>
+    <w:p>
+      <w:pPr>
+        <w:pStyle w:val="FirstParagraph"/>
+      </w:pPr>
+      <w:r>
+        <w:t xml:space="preserve">Concrete case study for Assignment 2 pitch (</w:t>
+      </w:r>
+      <w:r>
+        <w:rPr>
+          <w:rStyle w:val="VerbatimChar"/>
+        </w:rPr>
+        <w:t xml:space="preserve">docs/assignment2/A2_pitch_outline.md</w:t>
+      </w:r>
+      <w:r>
+        <w:t xml:space="preserve">):</w:t>
+      </w:r>
+    </w:p>
+    <w:p>
+      <w:pPr>
+        <w:pStyle w:val="Compact"/>
+        <w:numPr>
+          <w:ilvl w:val="0"/>
+          <w:numId w:val="1003"/>
+        </w:numPr>
+      </w:pPr>
+      <w:r>
+        <w:t xml:space="preserve">Softest Q&amp;A print:</w:t>
+      </w:r>
+      <w:r>
+        <w:t xml:space="preserve"> </w:t>
+      </w:r>
+      <w:r>
+        <w:rPr>
+          <w:b/>
+          <w:bCs/>
+        </w:rPr>
+        <w:t xml:space="preserve">HSBC 2025-interim</w:t>
+      </w:r>
+      <w:r>
+        <w:t xml:space="preserve"> </w:t>
+      </w:r>
+      <w:r>
+        <w:t xml:space="preserve">(FinBERT net ≈</w:t>
+      </w:r>
+      <w:r>
+        <w:t xml:space="preserve"> </w:t>
+      </w:r>
+      <w:r>
+        <w:rPr>
+          <w:b/>
+          <w:bCs/>
+        </w:rPr>
+        <w:t xml:space="preserve">−0.13</w:t>
+      </w:r>
+      <w:r>
+        <w:t xml:space="preserve">); Topic 1 = 5/8 turns (40% negative).</w:t>
+      </w:r>
+    </w:p>
+    <w:p>
+      <w:pPr>
+        <w:pStyle w:val="Compact"/>
+        <w:numPr>
+          <w:ilvl w:val="0"/>
+          <w:numId w:val="1003"/>
+        </w:numPr>
+      </w:pPr>
+      <w:r>
+        <w:t xml:space="preserve">Matched</w:t>
+      </w:r>
+      <w:r>
+        <w:t xml:space="preserve"> </w:t>
+      </w:r>
+      <w:r>
+        <w:rPr>
+          <w:b/>
+          <w:bCs/>
+        </w:rPr>
+        <w:t xml:space="preserve">2025-H1</w:t>
+      </w:r>
+      <w:r>
+        <w:t xml:space="preserve">: HSBC −0.13 (n=8) vs Barclays</w:t>
+      </w:r>
+      <w:r>
+        <w:t xml:space="preserve"> </w:t>
+      </w:r>
+      <w:r>
+        <w:rPr>
+          <w:b/>
+          <w:bCs/>
+        </w:rPr>
+        <w:t xml:space="preserve">0.00</w:t>
+      </w:r>
+      <w:r>
+        <w:t xml:space="preserve"> </w:t>
+      </w:r>
+      <w:r>
+        <w:t xml:space="preserve">(n=6, all FinBERT-neutral). Gap equals HSBC’s net →</w:t>
+      </w:r>
+      <w:r>
+        <w:t xml:space="preserve"> </w:t>
+      </w:r>
+      <w:r>
+        <w:rPr>
+          <w:b/>
+          <w:bCs/>
+        </w:rPr>
+        <w:t xml:space="preserve">not A2-eligible</w:t>
+      </w:r>
+      <w:r>
+        <w:t xml:space="preserve"> </w:t>
+      </w:r>
+      <w:r>
+        <w:t xml:space="preserve">(peer quality gate).</w:t>
+      </w:r>
+    </w:p>
+    <w:p>
+      <w:pPr>
+        <w:pStyle w:val="Compact"/>
+        <w:numPr>
+          <w:ilvl w:val="0"/>
+          <w:numId w:val="1003"/>
+        </w:numPr>
+      </w:pPr>
+      <w:r>
+        <w:t xml:space="preserve">Claim-vs-source vs</w:t>
+      </w:r>
+      <w:r>
+        <w:t xml:space="preserve"> </w:t>
+      </w:r>
+      <w:r>
+        <w:rPr>
+          <w:b/>
+          <w:bCs/>
+        </w:rPr>
+        <w:t xml:space="preserve">2025-q2</w:t>
+      </w:r>
+      <w:r>
+        <w:t xml:space="preserve"> </w:t>
+      </w:r>
+      <w:r>
+        <w:t xml:space="preserve">pack: Q&amp;A tone</w:t>
+      </w:r>
+      <w:r>
+        <w:t xml:space="preserve"> </w:t>
+      </w:r>
+      <w:r>
+        <w:rPr>
+          <w:b/>
+          <w:bCs/>
+        </w:rPr>
+        <w:t xml:space="preserve">agrees</w:t>
+      </w:r>
+      <w:r>
+        <w:t xml:space="preserve"> </w:t>
+      </w:r>
+      <w:r>
+        <w:t xml:space="preserve">with reported directions →</w:t>
+      </w:r>
+      <w:r>
+        <w:t xml:space="preserve"> </w:t>
+      </w:r>
+      <w:r>
+        <w:rPr>
+          <w:b/>
+          <w:bCs/>
+        </w:rPr>
+        <w:t xml:space="preserve">A3 WATCH</w:t>
+      </w:r>
+      <w:r>
+        <w:t xml:space="preserve">.</w:t>
+      </w:r>
+    </w:p>
+    <w:p>
+      <w:pPr>
+        <w:pStyle w:val="Compact"/>
+        <w:numPr>
+          <w:ilvl w:val="0"/>
+          <w:numId w:val="1003"/>
+        </w:numPr>
+      </w:pPr>
+      <w:r>
+        <w:t xml:space="preserve">Missing Q&amp;A metric hits now score</w:t>
+      </w:r>
+      <w:r>
+        <w:t xml:space="preserve"> </w:t>
+      </w:r>
+      <w:r>
+        <w:rPr>
+          <w:b/>
+          <w:bCs/>
+        </w:rPr>
+        <w:t xml:space="preserve">n/a</w:t>
+      </w:r>
+      <w:r>
+        <w:t xml:space="preserve">, not agreement. Verdicts:</w:t>
+      </w:r>
+      <w:r>
+        <w:t xml:space="preserve"> </w:t>
+      </w:r>
+      <w:r>
+        <w:rPr>
+          <w:rStyle w:val="VerbatimChar"/>
+        </w:rPr>
+        <w:t xml:space="preserve">supervisory_episodes.json</w:t>
+      </w:r>
+      <w:r>
+        <w:t xml:space="preserve">.</w:t>
+      </w:r>
+    </w:p>
+    <w:p>
+      <w:pPr>
+        <w:pStyle w:val="FirstParagraph"/>
+      </w:pPr>
+      <w:r>
+        <w:rPr>
+          <w:b/>
+          <w:bCs/>
+        </w:rPr>
+        <w:t xml:space="preserve">Pipelines</w:t>
+      </w:r>
+      <w:r>
+        <w:t xml:space="preserve"> </w:t>
+      </w:r>
+      <w:r>
+        <w:t xml:space="preserve">(ingest → topics → sentiment → baselines → decision → PRA note):</w:t>
+      </w:r>
+      <w:r>
+        <w:t xml:space="preserve"> </w:t>
+      </w:r>
+      <w:r>
+        <w:rPr>
+          <w:rStyle w:val="VerbatimChar"/>
+        </w:rPr>
+        <w:t xml:space="preserve">docs/assignment2/pipelines.md</w:t>
+      </w:r>
+      <w:r>
+        <w:t xml:space="preserve">.</w:t>
+      </w:r>
+    </w:p>
+    <w:p>
+      <w:pPr>
+        <w:pStyle w:val="BodyText"/>
+      </w:pPr>
+      <w:r>
+        <w:rPr>
+          <w:b/>
+          <w:bCs/>
+        </w:rPr>
+        <w:t xml:space="preserve">Stage 9:</w:t>
+      </w:r>
+      <w:r>
+        <w:t xml:space="preserve"> </w:t>
+      </w:r>
+      <w:r>
+        <w:t xml:space="preserve">Second episode</w:t>
+      </w:r>
+      <w:r>
+        <w:t xml:space="preserve"> </w:t>
+      </w:r>
+      <w:r>
+        <w:rPr>
+          <w:b/>
+          <w:bCs/>
+        </w:rPr>
+        <w:t xml:space="preserve">Barclays 2026-q2</w:t>
+      </w:r>
+      <w:r>
+        <w:t xml:space="preserve"> </w:t>
+      </w:r>
+      <w:r>
+        <w:t xml:space="preserve">= WATCH (A3); dual PRA notes in</w:t>
+      </w:r>
+      <w:r>
+        <w:t xml:space="preserve"> </w:t>
+      </w:r>
+      <w:r>
+        <w:rPr>
+          <w:rStyle w:val="VerbatimChar"/>
+        </w:rPr>
+        <w:t xml:space="preserve">docs/assignment2/pra_notes/</w:t>
+      </w:r>
+      <w:r>
+        <w:t xml:space="preserve">; extractive metric briefs in</w:t>
+      </w:r>
+      <w:r>
+        <w:t xml:space="preserve"> </w:t>
+      </w:r>
+      <w:r>
+        <w:rPr>
+          <w:rStyle w:val="VerbatimChar"/>
+        </w:rPr>
+        <w:t xml:space="preserve">metric_briefs_faithful.csv</w:t>
+      </w:r>
+      <w:r>
+        <w:t xml:space="preserve">; re-run checklist</w:t>
+      </w:r>
+      <w:r>
+        <w:t xml:space="preserve"> </w:t>
+      </w:r>
+      <w:r>
+        <w:rPr>
+          <w:rStyle w:val="VerbatimChar"/>
+        </w:rPr>
+        <w:t xml:space="preserve">docs/assignment2/rerun_checklist.md</w:t>
+      </w:r>
+      <w:r>
+        <w:t xml:space="preserve">.</w:t>
+      </w:r>
+    </w:p>
+    <w:bookmarkEnd w:id="26"/>
+    <w:bookmarkStart w:id="27" w:name="recommendations"/>
     <w:p>
       <w:pPr>
         <w:pStyle w:val="Heading2"/>
@@ -3110,8 +3429,8 @@
         </w:pict>
       </w:r>
     </w:p>
-    <w:bookmarkEnd w:id="26"/>
-    <w:bookmarkStart w:id="27" w:name="limitations-next-steps"/>
+    <w:bookmarkEnd w:id="27"/>
+    <w:bookmarkStart w:id="28" w:name="limitations-next-steps"/>
     <w:p>
       <w:pPr>
         <w:pStyle w:val="Heading2"/>
@@ -3163,8 +3482,8 @@
         </w:pict>
       </w:r>
     </w:p>
-    <w:bookmarkEnd w:id="27"/>
-    <w:bookmarkStart w:id="28" w:name="appendix-reproducibility"/>
+    <w:bookmarkEnd w:id="28"/>
+    <w:bookmarkStart w:id="29" w:name="appendix-reproducibility"/>
     <w:p>
       <w:pPr>
         <w:pStyle w:val="Heading2"/>
@@ -3178,7 +3497,7 @@
         <w:pStyle w:val="Compact"/>
         <w:numPr>
           <w:ilvl w:val="0"/>
-          <w:numId w:val="1003"/>
+          <w:numId w:val="1004"/>
         </w:numPr>
       </w:pPr>
       <w:r>
@@ -3193,7 +3512,7 @@
         <w:pStyle w:val="Compact"/>
         <w:numPr>
           <w:ilvl w:val="0"/>
-          <w:numId w:val="1003"/>
+          <w:numId w:val="1004"/>
         </w:numPr>
       </w:pPr>
       <w:r>
@@ -3217,7 +3536,7 @@
         <w:pStyle w:val="Compact"/>
         <w:numPr>
           <w:ilvl w:val="0"/>
-          <w:numId w:val="1003"/>
+          <w:numId w:val="1004"/>
         </w:numPr>
       </w:pPr>
       <w:r>
@@ -3241,7 +3560,7 @@
         <w:pStyle w:val="Compact"/>
         <w:numPr>
           <w:ilvl w:val="0"/>
-          <w:numId w:val="1003"/>
+          <w:numId w:val="1004"/>
         </w:numPr>
       </w:pPr>
       <w:r>
@@ -3280,7 +3599,7 @@
         <w:pStyle w:val="Compact"/>
         <w:numPr>
           <w:ilvl w:val="0"/>
-          <w:numId w:val="1003"/>
+          <w:numId w:val="1004"/>
         </w:numPr>
       </w:pPr>
       <w:r>
@@ -3319,7 +3638,7 @@
         <w:pStyle w:val="Compact"/>
         <w:numPr>
           <w:ilvl w:val="0"/>
-          <w:numId w:val="1003"/>
+          <w:numId w:val="1004"/>
         </w:numPr>
       </w:pPr>
       <w:r>
@@ -3341,8 +3660,8 @@
         <w:t xml:space="preserve">(gitignored; rebuild via script)</w:t>
       </w:r>
     </w:p>
-    <w:bookmarkEnd w:id="28"/>
     <w:bookmarkEnd w:id="29"/>
+    <w:bookmarkEnd w:id="30"/>
     <w:sectPr>
       <w:footnotePr>
         <w:numRestart w:val="eachSect"/>
@@ -3678,6 +3997,9 @@
     </w:lvlOverride>
   </w:num>
   <w:num w:numId="1003">
+    <w:abstractNumId w:val="991"/>
+  </w:num>
+  <w:num w:numId="1004">
     <w:abstractNumId w:val="991"/>
   </w:num>
 </w:numbering>

</xml_diff>